<commit_message>
SecureVault 1.0.2 (build 3)
- CocoaPods: SecureVault.podspec builds the whole SDK as one SecureVault
  module. Cross-module imports are now conditional, so the same sources
  build as a pod and as a Swift package. pod lib lint passes for iOS
  and macOS.
- Example app: Example/SecureVaultExample, an iOS 17 app with one screen
  per feature in SwiftUI and an Objective-C screen, plus a test target
  that runs inside the app on the real data-protection Keychain
  (6 tests pass on the iOS Simulator).
- SecureDatabase.all(_:where:) takes a @Sendable filter, so SwiftUI
  views can call it under Swift 6.
- README and spec: repository URL; Xcode, Package.swift and CocoaPods
  install steps; the example app; version 1.0.2 (build 3).
</commit_message>
<xml_diff>
--- a/docs/SecureVault_PRD_v1.0.docx
+++ b/docs/SecureVault_PRD_v1.0.docx
@@ -841,6 +841,85 @@
                 <w:sz w:val="18"/>
                 <w:szCs w:val="18"/>
               </w:rPr>
+              <w:t xml:space="preserve">Repository</w:t>
+            </w:r>
+          </w:p>
+        </w:tc>
+        <w:tc>
+          <w:tcPr>
+            <w:tcW w:type="dxa" w:w="7160"/>
+            <w:tcBorders>
+              <w:top w:val="none" w:color="FFFFFF" w:sz="0"/>
+              <w:left w:val="none" w:color="FFFFFF" w:sz="0"/>
+              <w:bottom w:val="single" w:color="D5DCE6" w:sz="4"/>
+              <w:right w:val="none" w:color="FFFFFF" w:sz="0"/>
+            </w:tcBorders>
+            <w:tcMar>
+              <w:top w:type="dxa" w:w="90"/>
+              <w:left w:type="dxa" w:w="120"/>
+              <w:bottom w:type="dxa" w:w="90"/>
+              <w:right w:type="dxa" w:w="120"/>
+            </w:tcMar>
+            <w:vAlign w:val="top"/>
+          </w:tcPr>
+          <w:p>
+            <w:pPr>
+              <w:spacing w:after="0" w:line="252"/>
+            </w:pPr>
+            <w:r>
+              <w:rPr>
+                <w:rFonts w:ascii="Menlo" w:cs="Menlo" w:eastAsia="Menlo" w:hAnsi="Menlo"/>
+                <w:color w:val="14304F"/>
+                <w:sz w:val="18"/>
+                <w:szCs w:val="18"/>
+              </w:rPr>
+              <w:t xml:space="preserve">https://github.com/prakash-eppala/SecureVault.git</w:t>
+            </w:r>
+            <w:r>
+              <w:rPr>
+                <w:color w:val="1B2430"/>
+                <w:sz w:val="18"/>
+                <w:szCs w:val="18"/>
+              </w:rPr>
+              <w:t xml:space="preserve"> (private)</w:t>
+            </w:r>
+          </w:p>
+        </w:tc>
+      </w:tr>
+      <w:tr>
+        <w:trPr>
+          <w:cantSplit/>
+        </w:trPr>
+        <w:tc>
+          <w:tcPr>
+            <w:tcW w:type="dxa" w:w="2200"/>
+            <w:tcBorders>
+              <w:top w:val="none" w:color="FFFFFF" w:sz="0"/>
+              <w:left w:val="none" w:color="FFFFFF" w:sz="0"/>
+              <w:bottom w:val="single" w:color="D5DCE6" w:sz="4"/>
+              <w:right w:val="none" w:color="FFFFFF" w:sz="0"/>
+            </w:tcBorders>
+            <w:shd w:fill="F5F8FC" w:color="auto" w:val="clear"/>
+            <w:tcMar>
+              <w:top w:type="dxa" w:w="90"/>
+              <w:left w:type="dxa" w:w="120"/>
+              <w:bottom w:type="dxa" w:w="90"/>
+              <w:right w:type="dxa" w:w="120"/>
+            </w:tcMar>
+            <w:vAlign w:val="top"/>
+          </w:tcPr>
+          <w:p>
+            <w:pPr>
+              <w:spacing w:after="0" w:line="252"/>
+            </w:pPr>
+            <w:r>
+              <w:rPr>
+                <w:b/>
+                <w:bCs/>
+                <w:color w:val="14304F"/>
+                <w:sz w:val="18"/>
+                <w:szCs w:val="18"/>
+              </w:rPr>
               <w:t xml:space="preserve">SDK version</w:t>
             </w:r>
           </w:p>
@@ -854,25 +933,26 @@
               <w:bottom w:val="single" w:color="D5DCE6" w:sz="4"/>
               <w:right w:val="none" w:color="FFFFFF" w:sz="0"/>
             </w:tcBorders>
-            <w:tcMar>
-              <w:top w:type="dxa" w:w="90"/>
-              <w:left w:type="dxa" w:w="120"/>
-              <w:bottom w:type="dxa" w:w="90"/>
-              <w:right w:type="dxa" w:w="120"/>
-            </w:tcMar>
-            <w:vAlign w:val="top"/>
-          </w:tcPr>
-          <w:p>
-            <w:pPr>
-              <w:spacing w:after="0" w:line="252"/>
-            </w:pPr>
-            <w:r>
-              <w:rPr>
-                <w:color w:val="1B2430"/>
-                <w:sz w:val="18"/>
-                <w:szCs w:val="18"/>
-              </w:rPr>
-              <w:t xml:space="preserve">1.0.1 (build 2). Read it at run time from </w:t>
+            <w:shd w:fill="F5F8FC" w:color="auto" w:val="clear"/>
+            <w:tcMar>
+              <w:top w:type="dxa" w:w="90"/>
+              <w:left w:type="dxa" w:w="120"/>
+              <w:bottom w:type="dxa" w:w="90"/>
+              <w:right w:type="dxa" w:w="120"/>
+            </w:tcMar>
+            <w:vAlign w:val="top"/>
+          </w:tcPr>
+          <w:p>
+            <w:pPr>
+              <w:spacing w:after="0" w:line="252"/>
+            </w:pPr>
+            <w:r>
+              <w:rPr>
+                <w:color w:val="1B2430"/>
+                <w:sz w:val="18"/>
+                <w:szCs w:val="18"/>
+              </w:rPr>
+              <w:t xml:space="preserve">1.0.2 (build 3). Read it at run time from </w:t>
             </w:r>
             <w:r>
               <w:rPr>
@@ -2027,7 +2107,75 @@
                 <w:sz w:val="18"/>
                 <w:szCs w:val="18"/>
               </w:rPr>
-              <w:t xml:space="preserve">Swift Package Manager in V1. A prebuilt XCFramework is V2. CocoaPods and Carthage are not planned.</w:t>
+              <w:t xml:space="preserve">Swift Package Manager and CocoaPods, from </w:t>
+            </w:r>
+            <w:r>
+              <w:rPr>
+                <w:rFonts w:ascii="Menlo" w:cs="Menlo" w:eastAsia="Menlo" w:hAnsi="Menlo"/>
+                <w:color w:val="14304F"/>
+                <w:sz w:val="18"/>
+                <w:szCs w:val="18"/>
+              </w:rPr>
+              <w:t xml:space="preserve">https://github.com/prakash-eppala/SecureVault.git</w:t>
+            </w:r>
+            <w:r>
+              <w:rPr>
+                <w:color w:val="1B2430"/>
+                <w:sz w:val="18"/>
+                <w:szCs w:val="18"/>
+              </w:rPr>
+              <w:t xml:space="preserve"> (private). Versions are git tags; the current release is </w:t>
+            </w:r>
+            <w:r>
+              <w:rPr>
+                <w:rFonts w:ascii="Menlo" w:cs="Menlo" w:eastAsia="Menlo" w:hAnsi="Menlo"/>
+                <w:color w:val="14304F"/>
+                <w:sz w:val="18"/>
+                <w:szCs w:val="18"/>
+              </w:rPr>
+              <w:t xml:space="preserve">1.0.2</w:t>
+            </w:r>
+            <w:r>
+              <w:rPr>
+                <w:color w:val="1B2430"/>
+                <w:sz w:val="18"/>
+                <w:szCs w:val="18"/>
+              </w:rPr>
+              <w:t xml:space="preserve">. The pod (</w:t>
+            </w:r>
+            <w:r>
+              <w:rPr>
+                <w:rFonts w:ascii="Menlo" w:cs="Menlo" w:eastAsia="Menlo" w:hAnsi="Menlo"/>
+                <w:color w:val="14304F"/>
+                <w:sz w:val="18"/>
+                <w:szCs w:val="18"/>
+              </w:rPr>
+              <w:t xml:space="preserve">SecureVault.podspec</w:t>
+            </w:r>
+            <w:r>
+              <w:rPr>
+                <w:color w:val="1B2430"/>
+                <w:sz w:val="18"/>
+                <w:szCs w:val="18"/>
+              </w:rPr>
+              <w:t xml:space="preserve">) compiles every source file into one </w:t>
+            </w:r>
+            <w:r>
+              <w:rPr>
+                <w:rFonts w:ascii="Menlo" w:cs="Menlo" w:eastAsia="Menlo" w:hAnsi="Menlo"/>
+                <w:color w:val="14304F"/>
+                <w:sz w:val="18"/>
+                <w:szCs w:val="18"/>
+              </w:rPr>
+              <w:t xml:space="preserve">SecureVault</w:t>
+            </w:r>
+            <w:r>
+              <w:rPr>
+                <w:color w:val="1B2430"/>
+                <w:sz w:val="18"/>
+                <w:szCs w:val="18"/>
+              </w:rPr>
+              <w:t xml:space="preserve"> module, so imports match the Swift package. A prebuilt XCFramework is V2; Carthage is not planned.</w:t>
             </w:r>
           </w:p>
         </w:tc>
@@ -18365,6 +18513,35 @@
       </w:r>
     </w:p>
     <w:p>
+      <w:r>
+        <w:t xml:space="preserve">The repository also holds </w:t>
+      </w:r>
+      <w:r>
+        <w:rPr>
+          <w:rFonts w:ascii="Menlo" w:cs="Menlo" w:eastAsia="Menlo" w:hAnsi="Menlo"/>
+          <w:color w:val="14304F"/>
+          <w:sz w:val="19"/>
+          <w:szCs w:val="19"/>
+        </w:rPr>
+        <w:t xml:space="preserve">SecureVault.podspec</w:t>
+      </w:r>
+      <w:r>
+        <w:t xml:space="preserve"> and </w:t>
+      </w:r>
+      <w:r>
+        <w:rPr>
+          <w:rFonts w:ascii="Menlo" w:cs="Menlo" w:eastAsia="Menlo" w:hAnsi="Menlo"/>
+          <w:color w:val="14304F"/>
+          <w:sz w:val="19"/>
+          <w:szCs w:val="19"/>
+        </w:rPr>
+        <w:t xml:space="preserve">Example/</w:t>
+      </w:r>
+      <w:r>
+        <w:t xml:space="preserve">, an iOS app with one screen per feature (Swift, SwiftUI and Objective-C) and a hosted test target that runs on the real Keychain.</w:t>
+      </w:r>
+    </w:p>
+    <w:p>
       <w:pPr>
         <w:pStyle w:val="Heading1"/>
       </w:pPr>
@@ -20644,7 +20821,19 @@
         <w:t xml:space="preserve">swift test</w:t>
       </w:r>
       <w:r>
-        <w:t xml:space="preserve"> (unique test services, deleted afterwards). Tests against the data-protection Keychain skip themselves without a Keychain entitlement and need a host app on the Simulator or a device.</w:t>
+        <w:t xml:space="preserve"> (unique test services, deleted afterwards). The example app's hosted test target, </w:t>
+      </w:r>
+      <w:r>
+        <w:rPr>
+          <w:rFonts w:ascii="Menlo" w:cs="Menlo" w:eastAsia="Menlo" w:hAnsi="Menlo"/>
+          <w:color w:val="14304F"/>
+          <w:sz w:val="19"/>
+          <w:szCs w:val="19"/>
+        </w:rPr>
+        <w:t xml:space="preserve">SecureVaultExampleTests</w:t>
+      </w:r>
+      <w:r>
+        <w:t xml:space="preserve">, runs on the Simulator against the real data-protection Keychain and Data Protection, and exercises every example screen, including the Objective-C demo.</w:t>
       </w:r>
     </w:p>
     <w:p>

</xml_diff>